<commit_message>
docs: fix current authority references
</commit_message>
<xml_diff>
--- a/docs/Sorting_Apocalypse_Prototype_Findings_v0.10.docx
+++ b/docs/Sorting_Apocalypse_Prototype_Findings_v0.10.docx
@@ -624,7 +624,7 @@
               <w:rPr>
                 <w:sz w:val="18"/>
               </w:rPr>
-              <w:t>Service rooms, open Ops landing and three boundaries are retained in current Visual Direction v0.6; the accepted in-engine layout supplies dimensions. Historical schematics are not final construction drawings.</w:t>
+              <w:t>Service rooms, open Ops landing and three boundaries are retained in current Visual Direction v0.7; the accepted in-engine layout supplies dimensions. Historical schematics are not final construction drawings.</w:t>
             </w:r>
           </w:p>
         </w:tc>
@@ -6069,7 +6069,7 @@
         <w:widowControl/>
       </w:pPr>
       <w:r>
-        <w:t>GDD v0.9 retains the zoning rules promoted in the earlier storage gate. The representative catalogue evidence supports preserving that policy; service-space, greybox and continuing-wing updates do not reopen storage mechanics.</w:t>
+        <w:t>GDD v0.10 retains the zoning rules promoted in the earlier storage gate. The representative catalogue evidence supports preserving that policy; service-space, greybox and continuing-wing updates do not reopen storage mechanics.</w:t>
       </w:r>
     </w:p>
     <w:p>
@@ -11361,7 +11361,7 @@
         <w:widowControl/>
       </w:pPr>
       <w:r>
-        <w:t>Visual Direction v0.6 retains the established world/material grammar and dedicated service spaces, records the accepted in-engine layout, and adds the current storage-installation and ergonomics direction. The original V3/V2 images and v0.5 record remain historical references. Human spatial promotion applies to the accepted geometry, not final art, furnished production storage or physical Receiving. [V05, A17]</w:t>
+        <w:t>Visual Direction v0.7 retains the established world/material grammar and dedicated service spaces, records the accepted in-engine layout, and adds the current storage-installation and ergonomics direction. The original V3/V2 images and v0.5 record remain historical references. Human spatial promotion applies to the accepted geometry, not final art, furnished production storage or physical Receiving. [V05, A17]</w:t>
       </w:r>
     </w:p>
     <w:p>
@@ -14087,7 +14087,7 @@
               <w:rPr>
                 <w:sz w:val="18"/>
               </w:rPr>
-              <w:t>GDD v0.8 and Visual Direction v0.5 were the then-current scope and spatial authorities at the 17 September checkpoint; they did not establish that the next bridge was implemented. Current companions are GDD v0.9 and Visual Direction v0.6.</w:t>
+              <w:t>GDD v0.8 and Visual Direction v0.5 were the then-current scope and spatial authorities at the 17 September checkpoint; they did not establish that the next bridge was implemented. GDD v0.9 and Visual Direction v0.6 later superseded that checkpoint on 20 September; the current companions are GDD v0.10 and Visual Direction v0.7.</w:t>
             </w:r>
           </w:p>
         </w:tc>

</xml_diff>